<commit_message>
docs: se actualizo el documento de protocolo de pruebas añadiendo la informacion para realizar las pruebas de las nuevas funcionalidades creadas
</commit_message>
<xml_diff>
--- a/docs/Informe de ejecucion de pruebas.docx
+++ b/docs/Informe de ejecucion de pruebas.docx
@@ -18,6 +18,15 @@
     </w:p>
     <w:p>
       <w:pPr>
+        <w:pStyle w:val="Ttulo1"/>
+      </w:pPr>
+      <w:r>
+        <w:t>PP-01 Inicio de sesión y registro</w:t>
+      </w:r>
+    </w:p>
+    <w:p>
+      <w:pPr>
+        <w:ind w:left="372" w:firstLine="708"/>
         <w:rPr>
           <w:rFonts w:ascii="Times New Roman" w:hAnsi="Times New Roman" w:cs="Times New Roman"/>
         </w:rPr>
@@ -31,7 +40,7 @@
     </w:p>
     <w:p>
       <w:pPr>
-        <w:pStyle w:val="Ttulo1"/>
+        <w:pStyle w:val="Ttulo2"/>
       </w:pPr>
       <w:r>
         <w:t xml:space="preserve">Resultados de la ejecución </w:t>
@@ -39,10 +48,13 @@
     </w:p>
     <w:p>
       <w:pPr>
-        <w:pStyle w:val="Ttulo2"/>
-      </w:pPr>
-      <w:r>
-        <w:t xml:space="preserve">Registro exitoso (01): Funciono correctamente, después del registro se muestra un mensaje con la confirmación y en la BD se observa el usuario y la contraseña encriptada </w:t>
+        <w:pStyle w:val="Ttulo3"/>
+      </w:pPr>
+      <w:r>
+        <w:t>Registro exitoso (01): Funciono correctamente, después del registro se muestra un mensaje con la confirmación y en la BD se observa el usuario y la contraseña encriptada</w:t>
+      </w:r>
+      <w:r>
+        <w:t xml:space="preserve"> </w:t>
       </w:r>
       <w:r>
         <w:rPr>
@@ -219,7 +231,7 @@
           <w:noProof/>
         </w:rPr>
         <w:drawing>
-          <wp:inline distT="0" distB="0" distL="0" distR="0" wp14:anchorId="3A2B17FD" wp14:editId="611DFCD3">
+          <wp:inline distT="0" distB="0" distL="0" distR="0" wp14:anchorId="3A2B17FD" wp14:editId="0B5910A6">
             <wp:extent cx="5448300" cy="666750"/>
             <wp:effectExtent l="0" t="0" r="0" b="0"/>
             <wp:docPr id="2057584043" name="Imagen 1" descr="Interfaz de usuario gráfica, Texto, Aplicación, Correo electrónico&#10;&#10;El contenido generado por IA puede ser incorrecto."/>
@@ -294,13 +306,16 @@
     </w:p>
     <w:p>
       <w:pPr>
-        <w:pStyle w:val="Ttulo2"/>
+        <w:pStyle w:val="Ttulo3"/>
       </w:pPr>
       <w:r>
         <w:lastRenderedPageBreak/>
         <w:t>Usuario existente (02): Mensaje mostrado correctamente evitando que un usuario tenga otro nombre</w:t>
       </w:r>
       <w:r>
+        <w:rPr>
+          <w:noProof/>
+        </w:rPr>
         <w:drawing>
           <wp:inline distT="0" distB="0" distL="0" distR="0" wp14:anchorId="65E168D5" wp14:editId="59B3CC3A">
             <wp:extent cx="4817530" cy="1786269"/>
@@ -362,7 +377,7 @@
     </w:p>
     <w:p>
       <w:pPr>
-        <w:pStyle w:val="Ttulo2"/>
+        <w:pStyle w:val="Ttulo3"/>
       </w:pPr>
       <w:r>
         <w:t>Login exitoso (03): Después de iniciar sesión adecuadamente se redirecciono correctamente hacia el dashboard.</w:t>
@@ -534,7 +549,7 @@
     </w:p>
     <w:p>
       <w:pPr>
-        <w:pStyle w:val="Ttulo2"/>
+        <w:pStyle w:val="Ttulo3"/>
       </w:pPr>
       <w:r>
         <w:lastRenderedPageBreak/>
@@ -550,6 +565,9 @@
         <w:t xml:space="preserve"> </w:t>
       </w:r>
       <w:r>
+        <w:rPr>
+          <w:noProof/>
+        </w:rPr>
         <w:drawing>
           <wp:inline distT="0" distB="0" distL="0" distR="0" wp14:anchorId="60CFA86C" wp14:editId="65F56BB9">
             <wp:extent cx="5178191" cy="2020186"/>
@@ -611,8 +629,7 @@
     </w:p>
     <w:p>
       <w:pPr>
-        <w:pStyle w:val="Ttulo2"/>
-        <w:jc w:val="both"/>
+        <w:pStyle w:val="Ttulo3"/>
       </w:pPr>
       <w:r>
         <w:t xml:space="preserve">Acceso sin </w:t>
@@ -623,10 +640,18 @@
       </w:r>
       <w:proofErr w:type="spellEnd"/>
       <w:r>
-        <w:t xml:space="preserve"> (05) : Al intentar acceder al dashboard manualmente sin </w:t>
+        <w:t xml:space="preserve"> (05) : Al intentar acceder al </w:t>
       </w:r>
       <w:proofErr w:type="spellStart"/>
       <w:r>
+        <w:t>dashboard</w:t>
+      </w:r>
+      <w:proofErr w:type="spellEnd"/>
+      <w:r>
+        <w:t xml:space="preserve"> manualmente sin </w:t>
+      </w:r>
+      <w:proofErr w:type="spellStart"/>
+      <w:r>
         <w:t>login</w:t>
       </w:r>
       <w:proofErr w:type="spellEnd"/>
@@ -648,6 +673,9 @@
         <w:t xml:space="preserve"> para que se haga la correspondiente autentificación </w:t>
       </w:r>
       <w:r>
+        <w:rPr>
+          <w:noProof/>
+        </w:rPr>
         <w:drawing>
           <wp:inline distT="0" distB="0" distL="0" distR="0" wp14:anchorId="7FB71F3C" wp14:editId="121554CB">
             <wp:extent cx="5305646" cy="2077715"/>
@@ -698,7 +726,21 @@
         <w:rPr>
           <w:rFonts w:ascii="Times New Roman" w:hAnsi="Times New Roman" w:cs="Times New Roman"/>
         </w:rPr>
-        <w:t xml:space="preserve">Imagen 8. Entrar al dashboard sin </w:t>
+        <w:t xml:space="preserve">Imagen 8. Entrar al </w:t>
+      </w:r>
+      <w:proofErr w:type="spellStart"/>
+      <w:r>
+        <w:rPr>
+          <w:rFonts w:ascii="Times New Roman" w:hAnsi="Times New Roman" w:cs="Times New Roman"/>
+        </w:rPr>
+        <w:t>dashboard</w:t>
+      </w:r>
+      <w:proofErr w:type="spellEnd"/>
+      <w:r>
+        <w:rPr>
+          <w:rFonts w:ascii="Times New Roman" w:hAnsi="Times New Roman" w:cs="Times New Roman"/>
+        </w:rPr>
+        <w:t xml:space="preserve"> sin </w:t>
       </w:r>
       <w:proofErr w:type="spellStart"/>
       <w:r>
@@ -715,6 +757,10 @@
         <w:ind w:left="708" w:firstLine="708"/>
       </w:pPr>
       <w:r>
+        <w:rPr>
+          <w:noProof/>
+        </w:rPr>
+        <w:lastRenderedPageBreak/>
         <w:drawing>
           <wp:inline distT="0" distB="0" distL="0" distR="0" wp14:anchorId="02B0A0A4" wp14:editId="077EE800">
             <wp:extent cx="5326690" cy="2047985"/>
@@ -778,10 +824,9 @@
     </w:p>
     <w:p>
       <w:pPr>
-        <w:pStyle w:val="Ttulo2"/>
-      </w:pPr>
-      <w:r>
-        <w:lastRenderedPageBreak/>
+        <w:pStyle w:val="Ttulo3"/>
+      </w:pPr>
+      <w:r>
         <w:t xml:space="preserve">Logout exitoso (06): La sesión se cerró correctamente y se redirecciono al </w:t>
       </w:r>
       <w:proofErr w:type="spellStart"/>
@@ -799,6 +844,9 @@
         <w:ind w:left="372" w:firstLine="708"/>
       </w:pPr>
       <w:r>
+        <w:rPr>
+          <w:noProof/>
+        </w:rPr>
         <w:drawing>
           <wp:inline distT="0" distB="0" distL="0" distR="0" wp14:anchorId="6C14C058" wp14:editId="5FC3030B">
             <wp:extent cx="5612130" cy="1656080"/>
@@ -894,6 +942,9 @@
         <w:ind w:left="372" w:firstLine="708"/>
       </w:pPr>
       <w:r>
+        <w:rPr>
+          <w:noProof/>
+        </w:rPr>
         <w:drawing>
           <wp:inline distT="0" distB="0" distL="0" distR="0" wp14:anchorId="242B9C73" wp14:editId="4BEC062A">
             <wp:extent cx="5612130" cy="2278380"/>
@@ -951,10 +1002,41 @@
     <w:p/>
     <w:p>
       <w:pPr>
-        <w:pStyle w:val="Ttulo1"/>
-      </w:pPr>
-      <w:r>
+        <w:pStyle w:val="Ttulo2"/>
+      </w:pPr>
+      <w:r>
+        <w:lastRenderedPageBreak/>
         <w:t xml:space="preserve">Conclusiones </w:t>
+      </w:r>
+    </w:p>
+    <w:p>
+      <w:pPr>
+        <w:pStyle w:val="NormalWeb"/>
+        <w:ind w:left="708" w:firstLine="372"/>
+        <w:jc w:val="both"/>
+      </w:pPr>
+      <w:r>
+        <w:t>El módulo de autenticación funciona correctamente bajo los escenarios evaluados.</w:t>
+      </w:r>
+      <w:r>
+        <w:br/>
+        <w:t xml:space="preserve">No se identificaron vulnerabilidades funcionales en los procesos de registro, </w:t>
+      </w:r>
+      <w:proofErr w:type="spellStart"/>
+      <w:r>
+        <w:t>login</w:t>
+      </w:r>
+      <w:proofErr w:type="spellEnd"/>
+      <w:r>
+        <w:t xml:space="preserve"> o </w:t>
+      </w:r>
+      <w:proofErr w:type="spellStart"/>
+      <w:r>
+        <w:t>logout</w:t>
+      </w:r>
+      <w:proofErr w:type="spellEnd"/>
+      <w:r>
+        <w:t>.</w:t>
       </w:r>
     </w:p>
     <w:p>
@@ -962,28 +1044,13 @@
         <w:pStyle w:val="NormalWeb"/>
         <w:ind w:firstLine="360"/>
       </w:pPr>
-      <w:r>
-        <w:t>El módulo de autenticación funciona correctamente bajo los escenarios evaluados.</w:t>
-      </w:r>
-      <w:r>
-        <w:br/>
-        <w:t xml:space="preserve">No se identificaron vulnerabilidades funcionales en los procesos de registro, </w:t>
-      </w:r>
-      <w:proofErr w:type="spellStart"/>
-      <w:r>
-        <w:t>login</w:t>
-      </w:r>
-      <w:proofErr w:type="spellEnd"/>
-      <w:r>
-        <w:t xml:space="preserve"> o </w:t>
-      </w:r>
-      <w:proofErr w:type="spellStart"/>
-      <w:r>
-        <w:t>logout</w:t>
-      </w:r>
-      <w:proofErr w:type="spellEnd"/>
-      <w:r>
-        <w:t>.</w:t>
+    </w:p>
+    <w:p>
+      <w:pPr>
+        <w:pStyle w:val="Ttulo1"/>
+      </w:pPr>
+      <w:r>
+        <w:t xml:space="preserve">PP-02 </w:t>
       </w:r>
     </w:p>
     <w:p/>
@@ -1002,8 +1069,8 @@
   <w:abstractNum w:abstractNumId="0" w15:restartNumberingAfterBreak="0">
     <w:nsid w:val="1F5E14DD"/>
     <w:multiLevelType w:val="hybridMultilevel"/>
-    <w:tmpl w:val="DD6E5DEA"/>
-    <w:lvl w:ilvl="0" w:tplc="612EB94A">
+    <w:tmpl w:val="D23E3740"/>
+    <w:lvl w:ilvl="0" w:tplc="1A4E6DF2">
       <w:start w:val="1"/>
       <w:numFmt w:val="decimal"/>
       <w:pStyle w:val="Ttulo2"/>
@@ -1092,8 +1159,8 @@
   <w:abstractNum w:abstractNumId="1" w15:restartNumberingAfterBreak="0">
     <w:nsid w:val="27BF7337"/>
     <w:multiLevelType w:val="hybridMultilevel"/>
-    <w:tmpl w:val="5CC09D2C"/>
-    <w:lvl w:ilvl="0" w:tplc="26CA6850">
+    <w:tmpl w:val="5C92AF44"/>
+    <w:lvl w:ilvl="0" w:tplc="65083904">
       <w:start w:val="1"/>
       <w:numFmt w:val="upperRoman"/>
       <w:pStyle w:val="Ttulo1"/>
@@ -1179,11 +1246,110 @@
       </w:pPr>
     </w:lvl>
   </w:abstractNum>
+  <w:abstractNum w:abstractNumId="2" w15:restartNumberingAfterBreak="0">
+    <w:nsid w:val="5B4E7BF9"/>
+    <w:multiLevelType w:val="hybridMultilevel"/>
+    <w:tmpl w:val="19460DEE"/>
+    <w:lvl w:ilvl="0" w:tplc="B3487BB2">
+      <w:start w:val="1"/>
+      <w:numFmt w:val="upperLetter"/>
+      <w:pStyle w:val="Ttulo3"/>
+      <w:lvlText w:val="%1."/>
+      <w:lvlJc w:val="left"/>
+      <w:pPr>
+        <w:ind w:left="1776" w:hanging="360"/>
+      </w:pPr>
+      <w:rPr>
+        <w:rFonts w:hint="default"/>
+      </w:rPr>
+    </w:lvl>
+    <w:lvl w:ilvl="1" w:tplc="240A0019" w:tentative="1">
+      <w:start w:val="1"/>
+      <w:numFmt w:val="lowerLetter"/>
+      <w:lvlText w:val="%2."/>
+      <w:lvlJc w:val="left"/>
+      <w:pPr>
+        <w:ind w:left="2496" w:hanging="360"/>
+      </w:pPr>
+    </w:lvl>
+    <w:lvl w:ilvl="2" w:tplc="240A001B" w:tentative="1">
+      <w:start w:val="1"/>
+      <w:numFmt w:val="lowerRoman"/>
+      <w:lvlText w:val="%3."/>
+      <w:lvlJc w:val="right"/>
+      <w:pPr>
+        <w:ind w:left="3216" w:hanging="180"/>
+      </w:pPr>
+    </w:lvl>
+    <w:lvl w:ilvl="3" w:tplc="240A000F" w:tentative="1">
+      <w:start w:val="1"/>
+      <w:numFmt w:val="decimal"/>
+      <w:lvlText w:val="%4."/>
+      <w:lvlJc w:val="left"/>
+      <w:pPr>
+        <w:ind w:left="3936" w:hanging="360"/>
+      </w:pPr>
+    </w:lvl>
+    <w:lvl w:ilvl="4" w:tplc="240A0019" w:tentative="1">
+      <w:start w:val="1"/>
+      <w:numFmt w:val="lowerLetter"/>
+      <w:lvlText w:val="%5."/>
+      <w:lvlJc w:val="left"/>
+      <w:pPr>
+        <w:ind w:left="4656" w:hanging="360"/>
+      </w:pPr>
+    </w:lvl>
+    <w:lvl w:ilvl="5" w:tplc="240A001B" w:tentative="1">
+      <w:start w:val="1"/>
+      <w:numFmt w:val="lowerRoman"/>
+      <w:lvlText w:val="%6."/>
+      <w:lvlJc w:val="right"/>
+      <w:pPr>
+        <w:ind w:left="5376" w:hanging="180"/>
+      </w:pPr>
+    </w:lvl>
+    <w:lvl w:ilvl="6" w:tplc="240A000F" w:tentative="1">
+      <w:start w:val="1"/>
+      <w:numFmt w:val="decimal"/>
+      <w:lvlText w:val="%7."/>
+      <w:lvlJc w:val="left"/>
+      <w:pPr>
+        <w:ind w:left="6096" w:hanging="360"/>
+      </w:pPr>
+    </w:lvl>
+    <w:lvl w:ilvl="7" w:tplc="240A0019" w:tentative="1">
+      <w:start w:val="1"/>
+      <w:numFmt w:val="lowerLetter"/>
+      <w:lvlText w:val="%8."/>
+      <w:lvlJc w:val="left"/>
+      <w:pPr>
+        <w:ind w:left="6816" w:hanging="360"/>
+      </w:pPr>
+    </w:lvl>
+    <w:lvl w:ilvl="8" w:tplc="240A001B" w:tentative="1">
+      <w:start w:val="1"/>
+      <w:numFmt w:val="lowerRoman"/>
+      <w:lvlText w:val="%9."/>
+      <w:lvlJc w:val="right"/>
+      <w:pPr>
+        <w:ind w:left="7536" w:hanging="180"/>
+      </w:pPr>
+    </w:lvl>
+  </w:abstractNum>
   <w:num w:numId="1" w16cid:durableId="443497546">
     <w:abstractNumId w:val="1"/>
   </w:num>
   <w:num w:numId="2" w16cid:durableId="256211378">
     <w:abstractNumId w:val="0"/>
+  </w:num>
+  <w:num w:numId="3" w16cid:durableId="2037346158">
+    <w:abstractNumId w:val="0"/>
+    <w:lvlOverride w:ilvl="0">
+      <w:startOverride w:val="1"/>
+    </w:lvlOverride>
+  </w:num>
+  <w:num w:numId="4" w16cid:durableId="370375288">
+    <w:abstractNumId w:val="2"/>
   </w:num>
 </w:numbering>
 </file>
@@ -1596,11 +1762,12 @@
     <w:link w:val="Ttulo1Car"/>
     <w:uiPriority w:val="9"/>
     <w:qFormat/>
-    <w:rsid w:val="0092615C"/>
+    <w:rsid w:val="00DF211C"/>
     <w:pPr>
       <w:numPr>
         <w:numId w:val="1"/>
       </w:numPr>
+      <w:jc w:val="center"/>
       <w:outlineLvl w:val="0"/>
     </w:pPr>
     <w:rPr>
@@ -1629,24 +1796,26 @@
   </w:style>
   <w:style w:type="paragraph" w:styleId="Ttulo3">
     <w:name w:val="heading 3"/>
-    <w:basedOn w:val="Normal"/>
-    <w:next w:val="Normal"/>
+    <w:next w:val="Ttulo2"/>
     <w:link w:val="Ttulo3Car"/>
+    <w:autoRedefine/>
     <w:uiPriority w:val="9"/>
-    <w:semiHidden/>
     <w:unhideWhenUsed/>
     <w:qFormat/>
-    <w:rsid w:val="008314E6"/>
+    <w:rsid w:val="00DF211C"/>
     <w:pPr>
       <w:keepNext/>
       <w:keepLines/>
+      <w:numPr>
+        <w:numId w:val="4"/>
+      </w:numPr>
       <w:spacing w:before="160" w:after="80"/>
       <w:outlineLvl w:val="2"/>
     </w:pPr>
     <w:rPr>
-      <w:rFonts w:eastAsiaTheme="majorEastAsia" w:cstheme="majorBidi"/>
-      <w:color w:val="0F4761" w:themeColor="accent1" w:themeShade="BF"/>
-      <w:sz w:val="28"/>
+      <w:rFonts w:ascii="Times New Roman" w:eastAsiaTheme="majorEastAsia" w:hAnsi="Times New Roman" w:cstheme="majorBidi"/>
+      <w:i/>
+      <w:color w:val="000000" w:themeColor="text1"/>
       <w:szCs w:val="28"/>
     </w:rPr>
   </w:style>
@@ -1785,7 +1954,6 @@
   <w:style w:type="character" w:default="1" w:styleId="Fuentedeprrafopredeter">
     <w:name w:val="Default Paragraph Font"/>
     <w:uiPriority w:val="1"/>
-    <w:semiHidden/>
     <w:unhideWhenUsed/>
   </w:style>
   <w:style w:type="table" w:default="1" w:styleId="Tablanormal">
@@ -1814,7 +1982,7 @@
     <w:basedOn w:val="Fuentedeprrafopredeter"/>
     <w:link w:val="Ttulo1"/>
     <w:uiPriority w:val="9"/>
-    <w:rsid w:val="0092615C"/>
+    <w:rsid w:val="00DF211C"/>
     <w:rPr>
       <w:rFonts w:ascii="Times New Roman" w:hAnsi="Times New Roman" w:cs="Times New Roman"/>
     </w:rPr>
@@ -1834,12 +2002,11 @@
     <w:basedOn w:val="Fuentedeprrafopredeter"/>
     <w:link w:val="Ttulo3"/>
     <w:uiPriority w:val="9"/>
-    <w:semiHidden/>
-    <w:rsid w:val="008314E6"/>
-    <w:rPr>
-      <w:rFonts w:eastAsiaTheme="majorEastAsia" w:cstheme="majorBidi"/>
-      <w:color w:val="0F4761" w:themeColor="accent1" w:themeShade="BF"/>
-      <w:sz w:val="28"/>
+    <w:rsid w:val="00DF211C"/>
+    <w:rPr>
+      <w:rFonts w:ascii="Times New Roman" w:eastAsiaTheme="majorEastAsia" w:hAnsi="Times New Roman" w:cstheme="majorBidi"/>
+      <w:i/>
+      <w:color w:val="000000" w:themeColor="text1"/>
       <w:szCs w:val="28"/>
     </w:rPr>
   </w:style>

</xml_diff>